<commit_message>
Prepare stored Admin state for multiplatform releases
Build the Windows, Linux, and macOS release bundles from the stored Admin and Master databases while excluding the operational database and received INI files.

Co-authored-by: Copilot <223556219+Copilot@users.noreply.github.com>
</commit_message>
<xml_diff>
--- a/do_not_use/modelli_doc/03modellodatiud.docx
+++ b/do_not_use/modelli_doc/03modellodatiud.docx
@@ -1636,7 +1636,7 @@
           <w:b/>
           <w:bCs/>
         </w:rPr>
-        <w:t>’UNITA’ DIDATTICA</w:t>
+        <w:t>’UNITA’ DI APPRENDIMENTO</w:t>
       </w:r>
       <w:r>
         <w:rPr>
@@ -3234,7 +3234,7 @@
           <w:b/>
           <w:bCs/>
         </w:rPr>
-        <w:t>’UNITA’ DIDATTICA</w:t>
+        <w:t>’UNITA’ DI APPRENDIMENTO</w:t>
       </w:r>
       <w:r>
         <w:rPr>
@@ -4908,7 +4908,7 @@
           <w:b/>
           <w:bCs/>
         </w:rPr>
-        <w:t>’UNITA’ DIDATTICA</w:t>
+        <w:t>’UNITA’ DI APPRENDIMENTO</w:t>
       </w:r>
       <w:r>
         <w:rPr>
@@ -7079,7 +7079,7 @@
           <w:b/>
           <w:bCs/>
         </w:rPr>
-        <w:t>’UNITA’ DIDATTICA</w:t>
+        <w:t>’UNITA’ DI APPRENDIMENTO</w:t>
       </w:r>
       <w:r>
         <w:rPr>
@@ -10657,7 +10657,7 @@
           <w:b/>
           <w:bCs/>
         </w:rPr>
-        <w:t>’UNITA’ DIDATTICA</w:t>
+        <w:t>’UNITA’ DI APPRENDIMENTO</w:t>
       </w:r>
       <w:r>
         <w:rPr>
@@ -14407,7 +14407,7 @@
                 <w:b/>
                 <w:bCs/>
               </w:rPr>
-              <w:t>DELLA UNITA’ DIDATTICA</w:t>
+              <w:t>DELLA UNITA’ DI APPRENDIMENTO</w:t>
             </w:r>
           </w:p>
           <w:p>
@@ -14472,7 +14472,7 @@
               <w:rPr>
                 <w:w w:val="112"/>
               </w:rPr>
-              <w:t xml:space="preserve"> (determina gli obiettivi fondanti dell’unità didattica</w:t>
+              <w:t xml:space="preserve"> (determina gli obiettivi fondanti dell’unità di apprendimento</w:t>
             </w:r>
             <w:proofErr w:type="gramStart"/>
             <w:r>

</xml_diff>